<commit_message>
Add real target HTML pages for all internal links and fix external link targets
</commit_message>
<xml_diff>
--- a/Job-01_SEO_Optimized_Blog_Post.docx
+++ b/Job-01_SEO_Optimized_Blog_Post.docx
@@ -4,7 +4,7 @@
   <w:body>
     <w:p>
       <w:pPr>
-        <w:divId w:val="2016371405"/>
+        <w:divId w:val="1412893377"/>
         <w:rPr>
           <w:rFonts w:ascii="Segoe UI" w:eastAsia="Times New Roman" w:hAnsi="Segoe UI" w:cs="Segoe UI"/>
           <w:color w:val="FFFFFF"/>
@@ -37,7 +37,7 @@
       <w:pPr>
         <w:spacing w:before="100" w:beforeAutospacing="1" w:after="120"/>
         <w:outlineLvl w:val="1"/>
-        <w:divId w:val="2016371405"/>
+        <w:divId w:val="1412893377"/>
         <w:rPr>
           <w:rFonts w:ascii="Segoe UI" w:eastAsia="Times New Roman" w:hAnsi="Segoe UI" w:cs="Segoe UI"/>
           <w:b/>
@@ -66,7 +66,7 @@
     <w:p>
       <w:pPr>
         <w:pStyle w:val="NormalWeb"/>
-        <w:divId w:val="2016371405"/>
+        <w:divId w:val="1412893377"/>
         <w:rPr>
           <w:rFonts w:ascii="Segoe UI" w:hAnsi="Segoe UI" w:cs="Segoe UI"/>
           <w:color w:val="FFFFFF"/>
@@ -84,7 +84,7 @@
     </w:p>
     <w:p>
       <w:pPr>
-        <w:divId w:val="2133867408"/>
+        <w:divId w:val="603147331"/>
         <w:rPr>
           <w:rFonts w:ascii="Segoe UI" w:eastAsia="Times New Roman" w:hAnsi="Segoe UI" w:cs="Segoe UI"/>
           <w:color w:val="FFFFFF"/>
@@ -117,7 +117,7 @@
     </w:p>
     <w:p>
       <w:pPr>
-        <w:divId w:val="183639268"/>
+        <w:divId w:val="1447577638"/>
         <w:rPr>
           <w:rFonts w:ascii="Segoe UI" w:eastAsia="Times New Roman" w:hAnsi="Segoe UI" w:cs="Segoe UI"/>
           <w:color w:val="FFFFFF"/>
@@ -150,7 +150,7 @@
     </w:p>
     <w:p>
       <w:pPr>
-        <w:divId w:val="1768455005"/>
+        <w:divId w:val="2010593526"/>
         <w:rPr>
           <w:rFonts w:ascii="Segoe UI" w:eastAsia="Times New Roman" w:hAnsi="Segoe UI" w:cs="Segoe UI"/>
           <w:color w:val="FFFFFF"/>
@@ -183,7 +183,7 @@
     </w:p>
     <w:p>
       <w:pPr>
-        <w:divId w:val="1522477953"/>
+        <w:divId w:val="1044524845"/>
         <w:rPr>
           <w:rFonts w:ascii="Segoe UI" w:eastAsia="Times New Roman" w:hAnsi="Segoe UI" w:cs="Segoe UI"/>
           <w:color w:val="FFFFFF"/>
@@ -216,7 +216,7 @@
     </w:p>
     <w:p>
       <w:pPr>
-        <w:divId w:val="64913363"/>
+        <w:divId w:val="631524003"/>
         <w:rPr>
           <w:rFonts w:ascii="Segoe UI" w:eastAsia="Times New Roman" w:hAnsi="Segoe UI" w:cs="Segoe UI"/>
           <w:lang w:val="en"/>
@@ -262,7 +262,7 @@
       <w:pPr>
         <w:pStyle w:val="Heading2"/>
         <w:spacing w:after="240" w:afterAutospacing="0"/>
-        <w:divId w:val="808286534"/>
+        <w:divId w:val="1872300638"/>
         <w:rPr>
           <w:rFonts w:ascii="Segoe UI" w:eastAsia="Times New Roman" w:hAnsi="Segoe UI" w:cs="Segoe UI"/>
           <w:sz w:val="30"/>
@@ -293,7 +293,7 @@
       <w:pPr>
         <w:pStyle w:val="NormalWeb"/>
         <w:spacing w:after="180" w:afterAutospacing="0"/>
-        <w:divId w:val="808286534"/>
+        <w:divId w:val="1872300638"/>
         <w:rPr>
           <w:rFonts w:ascii="Segoe UI" w:hAnsi="Segoe UI" w:cs="Segoe UI"/>
           <w:sz w:val="20"/>
@@ -314,7 +314,7 @@
     <w:p>
       <w:pPr>
         <w:shd w:val="clear" w:color="auto" w:fill="FFFFFF"/>
-        <w:divId w:val="1561163097"/>
+        <w:divId w:val="1638417668"/>
         <w:rPr>
           <w:rFonts w:ascii="Arial" w:eastAsia="Times New Roman" w:hAnsi="Arial" w:cs="Arial"/>
           <w:color w:val="202124"/>
@@ -347,7 +347,7 @@
     <w:p>
       <w:pPr>
         <w:shd w:val="clear" w:color="auto" w:fill="FFFFFF"/>
-        <w:divId w:val="1210148650"/>
+        <w:divId w:val="1826974358"/>
         <w:rPr>
           <w:rFonts w:ascii="Arial" w:eastAsia="Times New Roman" w:hAnsi="Arial" w:cs="Arial"/>
           <w:lang w:val="en"/>
@@ -378,7 +378,7 @@
     <w:p>
       <w:pPr>
         <w:shd w:val="clear" w:color="auto" w:fill="FFFFFF"/>
-        <w:divId w:val="333994265"/>
+        <w:divId w:val="1056706897"/>
         <w:rPr>
           <w:rFonts w:ascii="Arial" w:eastAsia="Times New Roman" w:hAnsi="Arial" w:cs="Arial"/>
           <w:color w:val="4D5156"/>
@@ -422,7 +422,7 @@
     <w:p>
       <w:pPr>
         <w:shd w:val="clear" w:color="auto" w:fill="F1F5F9"/>
-        <w:divId w:val="1260258768"/>
+        <w:divId w:val="775750925"/>
         <w:rPr>
           <w:rFonts w:ascii="Segoe UI" w:eastAsia="Times New Roman" w:hAnsi="Segoe UI" w:cs="Segoe UI"/>
           <w:b/>
@@ -449,7 +449,7 @@
     <w:p>
       <w:pPr>
         <w:shd w:val="clear" w:color="auto" w:fill="F1F5F9"/>
-        <w:divId w:val="2010785550"/>
+        <w:divId w:val="1504666957"/>
         <w:rPr>
           <w:rFonts w:ascii="Segoe UI" w:eastAsia="Times New Roman" w:hAnsi="Segoe UI" w:cs="Segoe UI"/>
           <w:b/>
@@ -482,7 +482,7 @@
     <w:p>
       <w:pPr>
         <w:shd w:val="clear" w:color="auto" w:fill="F1F5F9"/>
-        <w:divId w:val="930621188"/>
+        <w:divId w:val="274293546"/>
         <w:rPr>
           <w:rFonts w:ascii="Segoe UI" w:eastAsia="Times New Roman" w:hAnsi="Segoe UI" w:cs="Segoe UI"/>
           <w:b/>
@@ -509,7 +509,7 @@
     <w:p>
       <w:pPr>
         <w:shd w:val="clear" w:color="auto" w:fill="F1F5F9"/>
-        <w:divId w:val="1650669716"/>
+        <w:divId w:val="1565019675"/>
         <w:rPr>
           <w:rFonts w:ascii="Segoe UI" w:eastAsia="Times New Roman" w:hAnsi="Segoe UI" w:cs="Segoe UI"/>
           <w:b/>
@@ -542,7 +542,7 @@
     <w:p>
       <w:pPr>
         <w:shd w:val="clear" w:color="auto" w:fill="F1F5F9"/>
-        <w:divId w:val="1090006501"/>
+        <w:divId w:val="1482884923"/>
         <w:rPr>
           <w:rFonts w:ascii="Segoe UI" w:eastAsia="Times New Roman" w:hAnsi="Segoe UI" w:cs="Segoe UI"/>
           <w:b/>
@@ -569,7 +569,7 @@
     <w:p>
       <w:pPr>
         <w:shd w:val="clear" w:color="auto" w:fill="F1F5F9"/>
-        <w:divId w:val="916935998"/>
+        <w:divId w:val="1640106163"/>
         <w:rPr>
           <w:rFonts w:ascii="Segoe UI" w:eastAsia="Times New Roman" w:hAnsi="Segoe UI" w:cs="Segoe UI"/>
           <w:b/>
@@ -602,7 +602,7 @@
     <w:p>
       <w:pPr>
         <w:shd w:val="clear" w:color="auto" w:fill="F1F5F9"/>
-        <w:divId w:val="314065467"/>
+        <w:divId w:val="183053128"/>
         <w:rPr>
           <w:rFonts w:ascii="Segoe UI" w:eastAsia="Times New Roman" w:hAnsi="Segoe UI" w:cs="Segoe UI"/>
           <w:b/>
@@ -629,7 +629,7 @@
     <w:p>
       <w:pPr>
         <w:shd w:val="clear" w:color="auto" w:fill="F1F5F9"/>
-        <w:divId w:val="1679307566"/>
+        <w:divId w:val="2045711640"/>
         <w:rPr>
           <w:rFonts w:ascii="Segoe UI" w:eastAsia="Times New Roman" w:hAnsi="Segoe UI" w:cs="Segoe UI"/>
           <w:b/>
@@ -663,7 +663,7 @@
       <w:pPr>
         <w:pStyle w:val="Heading2"/>
         <w:spacing w:after="240" w:afterAutospacing="0"/>
-        <w:divId w:val="870454556"/>
+        <w:divId w:val="2132360993"/>
         <w:rPr>
           <w:rFonts w:ascii="Segoe UI" w:eastAsia="Times New Roman" w:hAnsi="Segoe UI" w:cs="Segoe UI"/>
           <w:sz w:val="30"/>
@@ -708,7 +708,7 @@
       </w:tblGrid>
       <w:tr>
         <w:trPr>
-          <w:divId w:val="870454556"/>
+          <w:divId w:val="2132360993"/>
           <w:tblHeader/>
         </w:trPr>
         <w:tc>
@@ -829,7 +829,7 @@
       </w:tr>
       <w:tr>
         <w:trPr>
-          <w:divId w:val="870454556"/>
+          <w:divId w:val="2132360993"/>
         </w:trPr>
         <w:tc>
           <w:tcPr>
@@ -925,7 +925,7 @@
       </w:tr>
       <w:tr>
         <w:trPr>
-          <w:divId w:val="870454556"/>
+          <w:divId w:val="2132360993"/>
         </w:trPr>
         <w:tc>
           <w:tcPr>
@@ -1082,7 +1082,7 @@
       </w:tr>
       <w:tr>
         <w:trPr>
-          <w:divId w:val="870454556"/>
+          <w:divId w:val="2132360993"/>
         </w:trPr>
         <w:tc>
           <w:tcPr>
@@ -1180,7 +1180,7 @@
       </w:tr>
       <w:tr>
         <w:trPr>
-          <w:divId w:val="870454556"/>
+          <w:divId w:val="2132360993"/>
         </w:trPr>
         <w:tc>
           <w:tcPr>
@@ -1276,7 +1276,7 @@
       </w:tr>
       <w:tr>
         <w:trPr>
-          <w:divId w:val="870454556"/>
+          <w:divId w:val="2132360993"/>
         </w:trPr>
         <w:tc>
           <w:tcPr>
@@ -1339,12 +1339,16 @@
               </w:rPr>
               <w:t xml:space="preserve">1. </w:t>
             </w:r>
-            <w:r>
-              <w:rPr>
-                <w:rStyle w:val="HTMLCode"/>
-              </w:rPr>
-              <w:t>/nutrition/beginner-meal-prep</w:t>
-            </w:r>
+            <w:hyperlink r:id="rId4" w:tgtFrame="_blank" w:history="1">
+              <w:r>
+                <w:rPr>
+                  <w:rStyle w:val="HTMLCode"/>
+                  <w:color w:val="0284C7"/>
+                  <w:u w:val="single"/>
+                </w:rPr>
+                <w:t>nutrition-guide.html</w:t>
+              </w:r>
+            </w:hyperlink>
             <w:r>
               <w:rPr>
                 <w:rFonts w:ascii="Segoe UI" w:eastAsia="Times New Roman" w:hAnsi="Segoe UI" w:cs="Segoe UI"/>
@@ -1362,12 +1366,16 @@
               <w:br/>
               <w:t xml:space="preserve">2. </w:t>
             </w:r>
-            <w:r>
-              <w:rPr>
-                <w:rStyle w:val="HTMLCode"/>
-              </w:rPr>
-              <w:t>/workouts/cardio-vs-strength</w:t>
-            </w:r>
+            <w:hyperlink r:id="rId5" w:tgtFrame="_blank" w:history="1">
+              <w:r>
+                <w:rPr>
+                  <w:rStyle w:val="HTMLCode"/>
+                  <w:color w:val="0284C7"/>
+                  <w:u w:val="single"/>
+                </w:rPr>
+                <w:t>cardio-vs-strength.html</w:t>
+              </w:r>
+            </w:hyperlink>
             <w:r>
               <w:rPr>
                 <w:rFonts w:ascii="Segoe UI" w:eastAsia="Times New Roman" w:hAnsi="Segoe UI" w:cs="Segoe UI"/>
@@ -1385,12 +1393,16 @@
               <w:br/>
               <w:t xml:space="preserve">3. </w:t>
             </w:r>
-            <w:r>
-              <w:rPr>
-                <w:rStyle w:val="HTMLCode"/>
-              </w:rPr>
-              <w:t>/wellness/muscle-recovery-tips</w:t>
-            </w:r>
+            <w:hyperlink r:id="rId6" w:tgtFrame="_blank" w:history="1">
+              <w:r>
+                <w:rPr>
+                  <w:rStyle w:val="HTMLCode"/>
+                  <w:color w:val="0284C7"/>
+                  <w:u w:val="single"/>
+                </w:rPr>
+                <w:t>muscle-recovery-tips.html</w:t>
+              </w:r>
+            </w:hyperlink>
             <w:r>
               <w:rPr>
                 <w:rFonts w:ascii="Segoe UI" w:eastAsia="Times New Roman" w:hAnsi="Segoe UI" w:cs="Segoe UI"/>
@@ -1427,14 +1439,14 @@
                 <w:rStyle w:val="badge-pass1"/>
                 <w:rFonts w:ascii="Segoe UI" w:eastAsia="Times New Roman" w:hAnsi="Segoe UI" w:cs="Segoe UI"/>
               </w:rPr>
-              <w:t>3 Links</w:t>
+              <w:t>3 Active Links</w:t>
             </w:r>
           </w:p>
         </w:tc>
       </w:tr>
       <w:tr>
         <w:trPr>
-          <w:divId w:val="870454556"/>
+          <w:divId w:val="2132360993"/>
         </w:trPr>
         <w:tc>
           <w:tcPr>
@@ -1495,8 +1507,20 @@
                 <w:sz w:val="21"/>
                 <w:szCs w:val="21"/>
               </w:rPr>
-              <w:t>1. World Health Organization (WHO) physical activity guidelines</w:t>
+              <w:t xml:space="preserve">1. </w:t>
             </w:r>
+            <w:hyperlink r:id="rId7" w:tgtFrame="_blank" w:history="1">
+              <w:r>
+                <w:rPr>
+                  <w:rStyle w:val="Hyperlink"/>
+                  <w:rFonts w:ascii="Segoe UI" w:eastAsia="Times New Roman" w:hAnsi="Segoe UI" w:cs="Segoe UI"/>
+                  <w:color w:val="0284C7"/>
+                  <w:sz w:val="21"/>
+                  <w:szCs w:val="21"/>
+                </w:rPr>
+                <w:t>World Health Organization (WHO) physical activity guidelines</w:t>
+              </w:r>
+            </w:hyperlink>
             <w:r>
               <w:rPr>
                 <w:rFonts w:ascii="Segoe UI" w:eastAsia="Times New Roman" w:hAnsi="Segoe UI" w:cs="Segoe UI"/>
@@ -1504,7 +1528,27 @@
                 <w:szCs w:val="21"/>
               </w:rPr>
               <w:br/>
-              <w:t xml:space="preserve">2. Harvard T.H. Chan School of Public Health </w:t>
+              <w:t xml:space="preserve">2. </w:t>
+            </w:r>
+            <w:hyperlink r:id="rId8" w:tgtFrame="_blank" w:history="1">
+              <w:r>
+                <w:rPr>
+                  <w:rStyle w:val="Hyperlink"/>
+                  <w:rFonts w:ascii="Segoe UI" w:eastAsia="Times New Roman" w:hAnsi="Segoe UI" w:cs="Segoe UI"/>
+                  <w:color w:val="0284C7"/>
+                  <w:sz w:val="21"/>
+                  <w:szCs w:val="21"/>
+                </w:rPr>
+                <w:t>Harvard T.H. Chan School of Public Health</w:t>
+              </w:r>
+            </w:hyperlink>
+            <w:r>
+              <w:rPr>
+                <w:rFonts w:ascii="Segoe UI" w:eastAsia="Times New Roman" w:hAnsi="Segoe UI" w:cs="Segoe UI"/>
+                <w:sz w:val="21"/>
+                <w:szCs w:val="21"/>
+              </w:rPr>
+              <w:t xml:space="preserve"> </w:t>
             </w:r>
           </w:p>
         </w:tc>
@@ -1544,7 +1588,7 @@
       <w:pPr>
         <w:pStyle w:val="Heading2"/>
         <w:spacing w:after="240" w:afterAutospacing="0"/>
-        <w:divId w:val="999114954"/>
+        <w:divId w:val="703558276"/>
         <w:rPr>
           <w:rFonts w:ascii="Segoe UI" w:eastAsia="Times New Roman" w:hAnsi="Segoe UI" w:cs="Segoe UI"/>
           <w:sz w:val="30"/>
@@ -1575,7 +1619,7 @@
       <w:pPr>
         <w:pStyle w:val="NormalWeb"/>
         <w:spacing w:after="300" w:afterAutospacing="0"/>
-        <w:divId w:val="999114954"/>
+        <w:divId w:val="703558276"/>
         <w:rPr>
           <w:rFonts w:ascii="Segoe UI" w:hAnsi="Segoe UI" w:cs="Segoe UI"/>
           <w:sz w:val="20"/>
@@ -1639,7 +1683,7 @@
         <w:shd w:val="clear" w:color="auto" w:fill="FFFFFF"/>
         <w:spacing w:before="100" w:beforeAutospacing="1" w:after="270"/>
         <w:outlineLvl w:val="1"/>
-        <w:divId w:val="305013107"/>
+        <w:divId w:val="999774942"/>
         <w:rPr>
           <w:rFonts w:ascii="Segoe UI" w:eastAsia="Times New Roman" w:hAnsi="Segoe UI" w:cs="Segoe UI"/>
           <w:b/>
@@ -1669,7 +1713,7 @@
     <w:p>
       <w:pPr>
         <w:shd w:val="clear" w:color="auto" w:fill="FFFFFF"/>
-        <w:divId w:val="1773745830"/>
+        <w:divId w:val="1733455637"/>
         <w:rPr>
           <w:rFonts w:ascii="Segoe UI" w:eastAsia="Times New Roman" w:hAnsi="Segoe UI" w:cs="Segoe UI"/>
           <w:sz w:val="20"/>
@@ -1710,7 +1754,7 @@
       <w:pPr>
         <w:shd w:val="clear" w:color="auto" w:fill="FFFFFF"/>
         <w:jc w:val="center"/>
-        <w:divId w:val="150289973"/>
+        <w:divId w:val="734815436"/>
         <w:rPr>
           <w:rFonts w:ascii="Segoe UI" w:eastAsia="Times New Roman" w:hAnsi="Segoe UI" w:cs="Segoe UI"/>
           <w:lang w:val="en"/>
@@ -1723,7 +1767,7 @@
           <w:lang w:val="en"/>
         </w:rPr>
         <w:drawing>
-          <wp:inline distT="0" distB="0" distL="0" distR="0" wp14:anchorId="12F941B7" wp14:editId="7F5AB2B0">
+          <wp:inline distT="0" distB="0" distL="0" distR="0" wp14:anchorId="064D106F" wp14:editId="557C1A8F">
             <wp:extent cx="7620000" cy="3810000"/>
             <wp:effectExtent l="0" t="0" r="0" b="0"/>
             <wp:docPr id="1" name="Picture 1" descr="Beginner doing morning stretching and daily fitness routine for beginners at home"/>
@@ -1740,13 +1784,13 @@
                     </pic:cNvPicPr>
                   </pic:nvPicPr>
                   <pic:blipFill>
-                    <a:blip r:embed="rId4">
+                    <a:blip r:embed="rId9">
                       <a:extLst>
                         <a:ext uri="{28A0092B-C50C-407E-A947-70E740481C1C}">
                           <a14:useLocalDpi xmlns:a14="http://schemas.microsoft.com/office/drawing/2010/main" val="0"/>
                         </a:ext>
                         <a:ext uri="{96DAC541-7B7A-43D3-8B79-37D633B846F1}">
-                          <asvg:svgBlip xmlns:asvg="http://schemas.microsoft.com/office/drawing/2016/SVG/main" r:link="rId5"/>
+                          <asvg:svgBlip xmlns:asvg="http://schemas.microsoft.com/office/drawing/2016/SVG/main" r:link="rId10"/>
                         </a:ext>
                       </a:extLst>
                     </a:blip>
@@ -1780,7 +1824,7 @@
         <w:shd w:val="clear" w:color="auto" w:fill="FFFFFF"/>
         <w:spacing w:before="90" w:after="240"/>
         <w:jc w:val="center"/>
-        <w:divId w:val="150289973"/>
+        <w:divId w:val="734815436"/>
         <w:rPr>
           <w:rFonts w:ascii="Segoe UI" w:hAnsi="Segoe UI" w:cs="Segoe UI"/>
           <w:color w:val="334155"/>
@@ -1805,7 +1849,7 @@
       <w:pPr>
         <w:shd w:val="clear" w:color="auto" w:fill="FFFFFF"/>
         <w:spacing w:before="100" w:beforeAutospacing="1" w:after="240"/>
-        <w:divId w:val="305013107"/>
+        <w:divId w:val="999774942"/>
         <w:rPr>
           <w:rFonts w:ascii="Segoe UI" w:hAnsi="Segoe UI" w:cs="Segoe UI"/>
           <w:color w:val="334155"/>
@@ -1850,15 +1894,7 @@
           <w:color w:val="334155"/>
           <w:lang w:val="en"/>
         </w:rPr>
-        <w:t xml:space="preserve"> </w:t>
-      </w:r>
-      <w:r>
-        <w:rPr>
-          <w:rFonts w:ascii="Segoe UI" w:hAnsi="Segoe UI" w:cs="Segoe UI"/>
-          <w:color w:val="334155"/>
-          <w:lang w:val="en"/>
-        </w:rPr>
-        <w:t xml:space="preserve">is the most sustainable way to boost energy, build strength, and improve your overall well-being. When you are just beginning, jumping into intense exercise programs often leads to burnout or muscle soreness. Instead, focusing on gentle, consistent habits helps you stay active every single day without feeling overwhelmed. </w:t>
+        <w:t xml:space="preserve"> is the most sustainable way to boost energy, build strength, and improve your overall well-being. When you are just beginning, jumping into intense exercise programs often leads to burnout or muscle soreness. Instead, focusing on gentle, consistent habits helps you stay active every single day without feeling overwhelmed. </w:t>
       </w:r>
     </w:p>
     <w:p>
@@ -1866,7 +1902,7 @@
         <w:shd w:val="clear" w:color="auto" w:fill="FFFFFF"/>
         <w:spacing w:before="420" w:after="180"/>
         <w:outlineLvl w:val="2"/>
-        <w:divId w:val="305013107"/>
+        <w:divId w:val="999774942"/>
         <w:rPr>
           <w:rFonts w:ascii="Segoe UI" w:eastAsia="Times New Roman" w:hAnsi="Segoe UI" w:cs="Segoe UI"/>
           <w:b/>
@@ -1894,7 +1930,7 @@
       <w:pPr>
         <w:shd w:val="clear" w:color="auto" w:fill="FFFFFF"/>
         <w:spacing w:before="100" w:beforeAutospacing="1" w:after="240"/>
-        <w:divId w:val="305013107"/>
+        <w:divId w:val="999774942"/>
         <w:rPr>
           <w:rFonts w:ascii="Segoe UI" w:hAnsi="Segoe UI" w:cs="Segoe UI"/>
           <w:color w:val="334155"/>
@@ -1909,7 +1945,7 @@
         </w:rPr>
         <w:t xml:space="preserve">Physical activity is a vital pillar of lifelong health. According to the </w:t>
       </w:r>
-      <w:hyperlink r:id="rId6" w:tgtFrame="_blank" w:history="1">
+      <w:hyperlink r:id="rId11" w:tgtFrame="_blank" w:history="1">
         <w:r>
           <w:rPr>
             <w:rFonts w:ascii="Segoe UI" w:hAnsi="Segoe UI" w:cs="Segoe UI"/>
@@ -1974,7 +2010,7 @@
         <w:shd w:val="clear" w:color="auto" w:fill="FFFFFF"/>
         <w:spacing w:before="420" w:after="180"/>
         <w:outlineLvl w:val="2"/>
-        <w:divId w:val="305013107"/>
+        <w:divId w:val="999774942"/>
         <w:rPr>
           <w:rFonts w:ascii="Segoe UI" w:eastAsia="Times New Roman" w:hAnsi="Segoe UI" w:cs="Segoe UI"/>
           <w:b/>
@@ -2003,7 +2039,7 @@
         <w:shd w:val="clear" w:color="auto" w:fill="FFFFFF"/>
         <w:spacing w:before="270" w:after="120"/>
         <w:outlineLvl w:val="3"/>
-        <w:divId w:val="305013107"/>
+        <w:divId w:val="999774942"/>
         <w:rPr>
           <w:rFonts w:ascii="Segoe UI" w:eastAsia="Times New Roman" w:hAnsi="Segoe UI" w:cs="Segoe UI"/>
           <w:b/>
@@ -2031,7 +2067,7 @@
       <w:pPr>
         <w:shd w:val="clear" w:color="auto" w:fill="FFFFFF"/>
         <w:spacing w:before="100" w:beforeAutospacing="1" w:after="240"/>
-        <w:divId w:val="305013107"/>
+        <w:divId w:val="999774942"/>
         <w:rPr>
           <w:rFonts w:ascii="Segoe UI" w:hAnsi="Segoe UI" w:cs="Segoe UI"/>
           <w:color w:val="334155"/>
@@ -2052,7 +2088,7 @@
         <w:shd w:val="clear" w:color="auto" w:fill="FFFFFF"/>
         <w:spacing w:before="270" w:after="120"/>
         <w:outlineLvl w:val="3"/>
-        <w:divId w:val="305013107"/>
+        <w:divId w:val="999774942"/>
         <w:rPr>
           <w:rFonts w:ascii="Segoe UI" w:eastAsia="Times New Roman" w:hAnsi="Segoe UI" w:cs="Segoe UI"/>
           <w:b/>
@@ -2080,7 +2116,7 @@
       <w:pPr>
         <w:shd w:val="clear" w:color="auto" w:fill="FFFFFF"/>
         <w:spacing w:before="100" w:beforeAutospacing="1" w:after="240"/>
-        <w:divId w:val="305013107"/>
+        <w:divId w:val="999774942"/>
         <w:rPr>
           <w:rFonts w:ascii="Segoe UI" w:hAnsi="Segoe UI" w:cs="Segoe UI"/>
           <w:color w:val="334155"/>
@@ -2118,7 +2154,7 @@
       <w:pPr>
         <w:shd w:val="clear" w:color="auto" w:fill="FFFFFF"/>
         <w:jc w:val="center"/>
-        <w:divId w:val="486898870"/>
+        <w:divId w:val="2140948520"/>
         <w:rPr>
           <w:rFonts w:ascii="Segoe UI" w:eastAsia="Times New Roman" w:hAnsi="Segoe UI" w:cs="Segoe UI"/>
           <w:lang w:val="en"/>
@@ -2131,7 +2167,7 @@
           <w:lang w:val="en"/>
         </w:rPr>
         <w:drawing>
-          <wp:inline distT="0" distB="0" distL="0" distR="0" wp14:anchorId="55860664" wp14:editId="11B01F4B">
+          <wp:inline distT="0" distB="0" distL="0" distR="0" wp14:anchorId="1513CE8C" wp14:editId="33E7883C">
             <wp:extent cx="7620000" cy="4000500"/>
             <wp:effectExtent l="0" t="0" r="0" b="0"/>
             <wp:docPr id="2" name="Picture 2" descr="Step-by-step home workout for beginners featuring basic bodyweight exercises"/>
@@ -2148,13 +2184,13 @@
                     </pic:cNvPicPr>
                   </pic:nvPicPr>
                   <pic:blipFill>
-                    <a:blip r:embed="rId7">
+                    <a:blip r:embed="rId12">
                       <a:extLst>
                         <a:ext uri="{28A0092B-C50C-407E-A947-70E740481C1C}">
                           <a14:useLocalDpi xmlns:a14="http://schemas.microsoft.com/office/drawing/2010/main" val="0"/>
                         </a:ext>
                         <a:ext uri="{96DAC541-7B7A-43D3-8B79-37D633B846F1}">
-                          <asvg:svgBlip xmlns:asvg="http://schemas.microsoft.com/office/drawing/2016/SVG/main" r:link="rId8"/>
+                          <asvg:svgBlip xmlns:asvg="http://schemas.microsoft.com/office/drawing/2016/SVG/main" r:link="rId13"/>
                         </a:ext>
                       </a:extLst>
                     </a:blip>
@@ -2188,7 +2224,7 @@
         <w:shd w:val="clear" w:color="auto" w:fill="FFFFFF"/>
         <w:spacing w:before="90" w:after="240"/>
         <w:jc w:val="center"/>
-        <w:divId w:val="486898870"/>
+        <w:divId w:val="2140948520"/>
         <w:rPr>
           <w:rFonts w:ascii="Segoe UI" w:hAnsi="Segoe UI" w:cs="Segoe UI"/>
           <w:color w:val="334155"/>
@@ -2214,7 +2250,7 @@
         <w:shd w:val="clear" w:color="auto" w:fill="FFFFFF"/>
         <w:spacing w:before="270" w:after="120"/>
         <w:outlineLvl w:val="3"/>
-        <w:divId w:val="305013107"/>
+        <w:divId w:val="999774942"/>
         <w:rPr>
           <w:rFonts w:ascii="Segoe UI" w:eastAsia="Times New Roman" w:hAnsi="Segoe UI" w:cs="Segoe UI"/>
           <w:b/>
@@ -2242,7 +2278,7 @@
       <w:pPr>
         <w:shd w:val="clear" w:color="auto" w:fill="FFFFFF"/>
         <w:spacing w:before="100" w:beforeAutospacing="1" w:after="240"/>
-        <w:divId w:val="305013107"/>
+        <w:divId w:val="999774942"/>
         <w:rPr>
           <w:rFonts w:ascii="Segoe UI" w:hAnsi="Segoe UI" w:cs="Segoe UI"/>
           <w:color w:val="334155"/>
@@ -2257,7 +2293,7 @@
         </w:rPr>
         <w:t xml:space="preserve">Cardiovascular exercise improves lung capacity and burns calories. You can walk briskly around your neighborhood, jog lightly in place, or follow low-impact dance moves. If you want to customize your routine further, read our </w:t>
       </w:r>
-      <w:hyperlink r:id="rId9" w:history="1">
+      <w:hyperlink r:id="rId14" w:tgtFrame="_blank" w:history="1">
         <w:r>
           <w:rPr>
             <w:rFonts w:ascii="Segoe UI" w:hAnsi="Segoe UI" w:cs="Segoe UI"/>
@@ -2282,7 +2318,7 @@
         <w:shd w:val="clear" w:color="auto" w:fill="FFFFFF"/>
         <w:spacing w:before="270" w:after="120"/>
         <w:outlineLvl w:val="3"/>
-        <w:divId w:val="305013107"/>
+        <w:divId w:val="999774942"/>
         <w:rPr>
           <w:rFonts w:ascii="Segoe UI" w:eastAsia="Times New Roman" w:hAnsi="Segoe UI" w:cs="Segoe UI"/>
           <w:b/>
@@ -2310,7 +2346,7 @@
       <w:pPr>
         <w:shd w:val="clear" w:color="auto" w:fill="FFFFFF"/>
         <w:spacing w:before="100" w:beforeAutospacing="1" w:after="240"/>
-        <w:divId w:val="305013107"/>
+        <w:divId w:val="999774942"/>
         <w:rPr>
           <w:rFonts w:ascii="Segoe UI" w:hAnsi="Segoe UI" w:cs="Segoe UI"/>
           <w:color w:val="334155"/>
@@ -2331,7 +2367,7 @@
         <w:shd w:val="clear" w:color="auto" w:fill="FFFFFF"/>
         <w:spacing w:before="270" w:after="120"/>
         <w:outlineLvl w:val="3"/>
-        <w:divId w:val="305013107"/>
+        <w:divId w:val="999774942"/>
         <w:rPr>
           <w:rFonts w:ascii="Segoe UI" w:eastAsia="Times New Roman" w:hAnsi="Segoe UI" w:cs="Segoe UI"/>
           <w:b/>
@@ -2359,7 +2395,7 @@
       <w:pPr>
         <w:shd w:val="clear" w:color="auto" w:fill="FFFFFF"/>
         <w:spacing w:before="100" w:beforeAutospacing="1" w:after="240"/>
-        <w:divId w:val="305013107"/>
+        <w:divId w:val="999774942"/>
         <w:rPr>
           <w:rFonts w:ascii="Segoe UI" w:hAnsi="Segoe UI" w:cs="Segoe UI"/>
           <w:color w:val="334155"/>
@@ -2374,7 +2410,7 @@
         </w:rPr>
         <w:t xml:space="preserve">Physical activity works hand-in-hand with what you eat. Drink plenty of water before and after exercising, and eat meals rich in lean proteins, complex carbohydrates, and vegetables. To build lasting nutrition habits alongside your workouts, consult our </w:t>
       </w:r>
-      <w:hyperlink r:id="rId10" w:history="1">
+      <w:hyperlink r:id="rId15" w:tgtFrame="_blank" w:history="1">
         <w:r>
           <w:rPr>
             <w:rFonts w:ascii="Segoe UI" w:hAnsi="Segoe UI" w:cs="Segoe UI"/>
@@ -2399,7 +2435,7 @@
         <w:shd w:val="clear" w:color="auto" w:fill="FFFFFF"/>
         <w:spacing w:before="270" w:after="120"/>
         <w:outlineLvl w:val="3"/>
-        <w:divId w:val="305013107"/>
+        <w:divId w:val="999774942"/>
         <w:rPr>
           <w:rFonts w:ascii="Segoe UI" w:eastAsia="Times New Roman" w:hAnsi="Segoe UI" w:cs="Segoe UI"/>
           <w:b/>
@@ -2427,7 +2463,7 @@
       <w:pPr>
         <w:shd w:val="clear" w:color="auto" w:fill="FFFFFF"/>
         <w:spacing w:before="100" w:beforeAutospacing="1" w:after="240"/>
-        <w:divId w:val="305013107"/>
+        <w:divId w:val="999774942"/>
         <w:rPr>
           <w:rFonts w:ascii="Segoe UI" w:hAnsi="Segoe UI" w:cs="Segoe UI"/>
           <w:color w:val="334155"/>
@@ -2488,7 +2524,7 @@
         <w:shd w:val="clear" w:color="auto" w:fill="FFFFFF"/>
         <w:spacing w:before="270" w:after="120"/>
         <w:outlineLvl w:val="3"/>
-        <w:divId w:val="305013107"/>
+        <w:divId w:val="999774942"/>
         <w:rPr>
           <w:rFonts w:ascii="Segoe UI" w:eastAsia="Times New Roman" w:hAnsi="Segoe UI" w:cs="Segoe UI"/>
           <w:b/>
@@ -2516,7 +2552,7 @@
       <w:pPr>
         <w:shd w:val="clear" w:color="auto" w:fill="FFFFFF"/>
         <w:spacing w:before="100" w:beforeAutospacing="1" w:after="240"/>
-        <w:divId w:val="305013107"/>
+        <w:divId w:val="999774942"/>
         <w:rPr>
           <w:rFonts w:ascii="Segoe UI" w:hAnsi="Segoe UI" w:cs="Segoe UI"/>
           <w:color w:val="334155"/>
@@ -2532,7 +2568,7 @@
         <w:lastRenderedPageBreak/>
         <w:t xml:space="preserve">Your muscles rebuild and grow stronger when you rest. Ensure you get 7 to 8 hours of restorative sleep each night. Learn more about the </w:t>
       </w:r>
-      <w:hyperlink r:id="rId11" w:history="1">
+      <w:hyperlink r:id="rId16" w:tgtFrame="_blank" w:history="1">
         <w:r>
           <w:rPr>
             <w:rFonts w:ascii="Segoe UI" w:hAnsi="Segoe UI" w:cs="Segoe UI"/>
@@ -2557,7 +2593,7 @@
         <w:shd w:val="clear" w:color="auto" w:fill="FFFFFF"/>
         <w:spacing w:before="420" w:after="180"/>
         <w:outlineLvl w:val="2"/>
-        <w:divId w:val="305013107"/>
+        <w:divId w:val="999774942"/>
         <w:rPr>
           <w:rFonts w:ascii="Segoe UI" w:eastAsia="Times New Roman" w:hAnsi="Segoe UI" w:cs="Segoe UI"/>
           <w:b/>
@@ -2585,7 +2621,7 @@
       <w:pPr>
         <w:shd w:val="clear" w:color="auto" w:fill="FFFFFF"/>
         <w:spacing w:before="100" w:beforeAutospacing="1" w:after="240"/>
-        <w:divId w:val="305013107"/>
+        <w:divId w:val="999774942"/>
         <w:rPr>
           <w:rFonts w:ascii="Segoe UI" w:hAnsi="Segoe UI" w:cs="Segoe UI"/>
           <w:color w:val="334155"/>
@@ -2600,7 +2636,7 @@
         </w:rPr>
         <w:t xml:space="preserve">Medical experts at the </w:t>
       </w:r>
-      <w:hyperlink r:id="rId12" w:tgtFrame="_blank" w:history="1">
+      <w:hyperlink r:id="rId17" w:tgtFrame="_blank" w:history="1">
         <w:r>
           <w:rPr>
             <w:rFonts w:ascii="Segoe UI" w:hAnsi="Segoe UI" w:cs="Segoe UI"/>
@@ -2657,7 +2693,7 @@
         <w:shd w:val="clear" w:color="auto" w:fill="FFFFFF"/>
         <w:spacing w:before="420" w:after="180"/>
         <w:outlineLvl w:val="2"/>
-        <w:divId w:val="305013107"/>
+        <w:divId w:val="999774942"/>
         <w:rPr>
           <w:rFonts w:ascii="Segoe UI" w:eastAsia="Times New Roman" w:hAnsi="Segoe UI" w:cs="Segoe UI"/>
           <w:b/>
@@ -2685,7 +2721,7 @@
       <w:pPr>
         <w:shd w:val="clear" w:color="auto" w:fill="FFFFFF"/>
         <w:spacing w:before="100" w:beforeAutospacing="1" w:after="240"/>
-        <w:divId w:val="305013107"/>
+        <w:divId w:val="999774942"/>
         <w:rPr>
           <w:rFonts w:ascii="Segoe UI" w:hAnsi="Segoe UI" w:cs="Segoe UI"/>
           <w:color w:val="334155"/>

</xml_diff>

<commit_message>
Remove NTVQF badge and Print button as requested
</commit_message>
<xml_diff>
--- a/Job-01_SEO_Optimized_Blog_Post.docx
+++ b/Job-01_SEO_Optimized_Blog_Post.docx
@@ -4,40 +4,9 @@
   <w:body>
     <w:p>
       <w:pPr>
-        <w:divId w:val="1412893377"/>
-        <w:rPr>
-          <w:rFonts w:ascii="Segoe UI" w:eastAsia="Times New Roman" w:hAnsi="Segoe UI" w:cs="Segoe UI"/>
-          <w:color w:val="FFFFFF"/>
-          <w:lang w:val="en"/>
-        </w:rPr>
-      </w:pPr>
-      <w:r>
-        <w:rPr>
-          <w:rFonts w:ascii="Segoe UI" w:eastAsia="Times New Roman" w:hAnsi="Segoe UI" w:cs="Segoe UI"/>
-          <w:b/>
-          <w:bCs/>
-          <w:color w:val="FFFFFF"/>
-          <w:sz w:val="20"/>
-          <w:szCs w:val="20"/>
-          <w:shd w:val="clear" w:color="auto" w:fill="2563EB"/>
-          <w:lang w:val="en"/>
-        </w:rPr>
-        <w:t>NTVQF / BTEB Assessment Deliverable</w:t>
-      </w:r>
-      <w:r>
-        <w:rPr>
-          <w:rFonts w:ascii="Segoe UI" w:eastAsia="Times New Roman" w:hAnsi="Segoe UI" w:cs="Segoe UI"/>
-          <w:color w:val="FFFFFF"/>
-          <w:lang w:val="en"/>
-        </w:rPr>
-        <w:t xml:space="preserve"> </w:t>
-      </w:r>
-    </w:p>
-    <w:p>
-      <w:pPr>
         <w:spacing w:before="100" w:beforeAutospacing="1" w:after="120"/>
         <w:outlineLvl w:val="1"/>
-        <w:divId w:val="1412893377"/>
+        <w:divId w:val="1661158614"/>
         <w:rPr>
           <w:rFonts w:ascii="Segoe UI" w:eastAsia="Times New Roman" w:hAnsi="Segoe UI" w:cs="Segoe UI"/>
           <w:b/>
@@ -66,7 +35,7 @@
     <w:p>
       <w:pPr>
         <w:pStyle w:val="NormalWeb"/>
-        <w:divId w:val="1412893377"/>
+        <w:divId w:val="1661158614"/>
         <w:rPr>
           <w:rFonts w:ascii="Segoe UI" w:hAnsi="Segoe UI" w:cs="Segoe UI"/>
           <w:color w:val="FFFFFF"/>
@@ -84,7 +53,7 @@
     </w:p>
     <w:p>
       <w:pPr>
-        <w:divId w:val="603147331"/>
+        <w:divId w:val="1940873984"/>
         <w:rPr>
           <w:rFonts w:ascii="Segoe UI" w:eastAsia="Times New Roman" w:hAnsi="Segoe UI" w:cs="Segoe UI"/>
           <w:color w:val="FFFFFF"/>
@@ -117,7 +86,7 @@
     </w:p>
     <w:p>
       <w:pPr>
-        <w:divId w:val="1447577638"/>
+        <w:divId w:val="480275547"/>
         <w:rPr>
           <w:rFonts w:ascii="Segoe UI" w:eastAsia="Times New Roman" w:hAnsi="Segoe UI" w:cs="Segoe UI"/>
           <w:color w:val="FFFFFF"/>
@@ -150,7 +119,7 @@
     </w:p>
     <w:p>
       <w:pPr>
-        <w:divId w:val="2010593526"/>
+        <w:divId w:val="1984775787"/>
         <w:rPr>
           <w:rFonts w:ascii="Segoe UI" w:eastAsia="Times New Roman" w:hAnsi="Segoe UI" w:cs="Segoe UI"/>
           <w:color w:val="FFFFFF"/>
@@ -183,7 +152,7 @@
     </w:p>
     <w:p>
       <w:pPr>
-        <w:divId w:val="1044524845"/>
+        <w:divId w:val="92477973"/>
         <w:rPr>
           <w:rFonts w:ascii="Segoe UI" w:eastAsia="Times New Roman" w:hAnsi="Segoe UI" w:cs="Segoe UI"/>
           <w:color w:val="FFFFFF"/>
@@ -216,53 +185,9 @@
     </w:p>
     <w:p>
       <w:pPr>
-        <w:divId w:val="631524003"/>
-        <w:rPr>
-          <w:rFonts w:ascii="Segoe UI" w:eastAsia="Times New Roman" w:hAnsi="Segoe UI" w:cs="Segoe UI"/>
-          <w:lang w:val="en"/>
-        </w:rPr>
-      </w:pPr>
-      <w:r>
-        <w:rPr>
-          <w:rFonts w:ascii="Segoe UI Emoji" w:eastAsia="Times New Roman" w:hAnsi="Segoe UI Emoji" w:cs="Segoe UI Emoji"/>
-          <w:lang w:val="en"/>
-        </w:rPr>
-        <w:t>🖨</w:t>
-      </w:r>
-      <w:r>
-        <w:rPr>
-          <w:rFonts w:ascii="Segoe UI Emoji" w:eastAsia="Times New Roman" w:hAnsi="Segoe UI Emoji" w:cs="Segoe UI Emoji"/>
-          <w:lang w:val="en"/>
-        </w:rPr>
-        <w:t>️</w:t>
-      </w:r>
-      <w:r>
-        <w:rPr>
-          <w:rFonts w:ascii="Segoe UI" w:eastAsia="Times New Roman" w:hAnsi="Segoe UI" w:cs="Segoe UI"/>
-          <w:lang w:val="en"/>
-        </w:rPr>
-        <w:t xml:space="preserve"> Print / Save to PD</w:t>
-      </w:r>
-      <w:r>
-        <w:rPr>
-          <w:rFonts w:ascii="Segoe UI" w:eastAsia="Times New Roman" w:hAnsi="Segoe UI" w:cs="Segoe UI"/>
-          <w:lang w:val="en"/>
-        </w:rPr>
-        <w:t>F</w:t>
-      </w:r>
-      <w:r>
-        <w:rPr>
-          <w:rFonts w:ascii="Segoe UI" w:eastAsia="Times New Roman" w:hAnsi="Segoe UI" w:cs="Segoe UI"/>
-          <w:lang w:val="en"/>
-        </w:rPr>
-        <w:t xml:space="preserve"> </w:t>
-      </w:r>
-    </w:p>
-    <w:p>
-      <w:pPr>
         <w:pStyle w:val="Heading2"/>
         <w:spacing w:after="240" w:afterAutospacing="0"/>
-        <w:divId w:val="1872300638"/>
+        <w:divId w:val="1073043802"/>
         <w:rPr>
           <w:rFonts w:ascii="Segoe UI" w:eastAsia="Times New Roman" w:hAnsi="Segoe UI" w:cs="Segoe UI"/>
           <w:sz w:val="30"/>
@@ -293,7 +218,7 @@
       <w:pPr>
         <w:pStyle w:val="NormalWeb"/>
         <w:spacing w:after="180" w:afterAutospacing="0"/>
-        <w:divId w:val="1872300638"/>
+        <w:divId w:val="1073043802"/>
         <w:rPr>
           <w:rFonts w:ascii="Segoe UI" w:hAnsi="Segoe UI" w:cs="Segoe UI"/>
           <w:sz w:val="20"/>
@@ -314,7 +239,7 @@
     <w:p>
       <w:pPr>
         <w:shd w:val="clear" w:color="auto" w:fill="FFFFFF"/>
-        <w:divId w:val="1638417668"/>
+        <w:divId w:val="1438912800"/>
         <w:rPr>
           <w:rFonts w:ascii="Arial" w:eastAsia="Times New Roman" w:hAnsi="Arial" w:cs="Arial"/>
           <w:color w:val="202124"/>
@@ -347,7 +272,7 @@
     <w:p>
       <w:pPr>
         <w:shd w:val="clear" w:color="auto" w:fill="FFFFFF"/>
-        <w:divId w:val="1826974358"/>
+        <w:divId w:val="2073919141"/>
         <w:rPr>
           <w:rFonts w:ascii="Arial" w:eastAsia="Times New Roman" w:hAnsi="Arial" w:cs="Arial"/>
           <w:lang w:val="en"/>
@@ -378,7 +303,7 @@
     <w:p>
       <w:pPr>
         <w:shd w:val="clear" w:color="auto" w:fill="FFFFFF"/>
-        <w:divId w:val="1056706897"/>
+        <w:divId w:val="1945989341"/>
         <w:rPr>
           <w:rFonts w:ascii="Arial" w:eastAsia="Times New Roman" w:hAnsi="Arial" w:cs="Arial"/>
           <w:color w:val="4D5156"/>
@@ -422,7 +347,7 @@
     <w:p>
       <w:pPr>
         <w:shd w:val="clear" w:color="auto" w:fill="F1F5F9"/>
-        <w:divId w:val="775750925"/>
+        <w:divId w:val="859123636"/>
         <w:rPr>
           <w:rFonts w:ascii="Segoe UI" w:eastAsia="Times New Roman" w:hAnsi="Segoe UI" w:cs="Segoe UI"/>
           <w:b/>
@@ -449,7 +374,7 @@
     <w:p>
       <w:pPr>
         <w:shd w:val="clear" w:color="auto" w:fill="F1F5F9"/>
-        <w:divId w:val="1504666957"/>
+        <w:divId w:val="591276209"/>
         <w:rPr>
           <w:rFonts w:ascii="Segoe UI" w:eastAsia="Times New Roman" w:hAnsi="Segoe UI" w:cs="Segoe UI"/>
           <w:b/>
@@ -482,7 +407,7 @@
     <w:p>
       <w:pPr>
         <w:shd w:val="clear" w:color="auto" w:fill="F1F5F9"/>
-        <w:divId w:val="274293546"/>
+        <w:divId w:val="1260211572"/>
         <w:rPr>
           <w:rFonts w:ascii="Segoe UI" w:eastAsia="Times New Roman" w:hAnsi="Segoe UI" w:cs="Segoe UI"/>
           <w:b/>
@@ -509,7 +434,7 @@
     <w:p>
       <w:pPr>
         <w:shd w:val="clear" w:color="auto" w:fill="F1F5F9"/>
-        <w:divId w:val="1565019675"/>
+        <w:divId w:val="122425661"/>
         <w:rPr>
           <w:rFonts w:ascii="Segoe UI" w:eastAsia="Times New Roman" w:hAnsi="Segoe UI" w:cs="Segoe UI"/>
           <w:b/>
@@ -542,7 +467,7 @@
     <w:p>
       <w:pPr>
         <w:shd w:val="clear" w:color="auto" w:fill="F1F5F9"/>
-        <w:divId w:val="1482884923"/>
+        <w:divId w:val="823668476"/>
         <w:rPr>
           <w:rFonts w:ascii="Segoe UI" w:eastAsia="Times New Roman" w:hAnsi="Segoe UI" w:cs="Segoe UI"/>
           <w:b/>
@@ -569,7 +494,7 @@
     <w:p>
       <w:pPr>
         <w:shd w:val="clear" w:color="auto" w:fill="F1F5F9"/>
-        <w:divId w:val="1640106163"/>
+        <w:divId w:val="359859266"/>
         <w:rPr>
           <w:rFonts w:ascii="Segoe UI" w:eastAsia="Times New Roman" w:hAnsi="Segoe UI" w:cs="Segoe UI"/>
           <w:b/>
@@ -602,7 +527,7 @@
     <w:p>
       <w:pPr>
         <w:shd w:val="clear" w:color="auto" w:fill="F1F5F9"/>
-        <w:divId w:val="183053128"/>
+        <w:divId w:val="1073702838"/>
         <w:rPr>
           <w:rFonts w:ascii="Segoe UI" w:eastAsia="Times New Roman" w:hAnsi="Segoe UI" w:cs="Segoe UI"/>
           <w:b/>
@@ -629,7 +554,7 @@
     <w:p>
       <w:pPr>
         <w:shd w:val="clear" w:color="auto" w:fill="F1F5F9"/>
-        <w:divId w:val="2045711640"/>
+        <w:divId w:val="1765882667"/>
         <w:rPr>
           <w:rFonts w:ascii="Segoe UI" w:eastAsia="Times New Roman" w:hAnsi="Segoe UI" w:cs="Segoe UI"/>
           <w:b/>
@@ -663,7 +588,7 @@
       <w:pPr>
         <w:pStyle w:val="Heading2"/>
         <w:spacing w:after="240" w:afterAutospacing="0"/>
-        <w:divId w:val="2132360993"/>
+        <w:divId w:val="244918617"/>
         <w:rPr>
           <w:rFonts w:ascii="Segoe UI" w:eastAsia="Times New Roman" w:hAnsi="Segoe UI" w:cs="Segoe UI"/>
           <w:sz w:val="30"/>
@@ -687,7 +612,16 @@
           <w:szCs w:val="30"/>
           <w:lang w:val="en"/>
         </w:rPr>
-        <w:t xml:space="preserve"> Keyword Research &amp; Specification Matrix</w:t>
+        <w:t xml:space="preserve"> Keyword Research &amp; </w:t>
+      </w:r>
+      <w:r>
+        <w:rPr>
+          <w:rFonts w:ascii="Segoe UI" w:eastAsia="Times New Roman" w:hAnsi="Segoe UI" w:cs="Segoe UI"/>
+          <w:sz w:val="30"/>
+          <w:szCs w:val="30"/>
+          <w:lang w:val="en"/>
+        </w:rPr>
+        <w:t>Specification Matrix</w:t>
       </w:r>
     </w:p>
     <w:tbl>
@@ -708,7 +642,7 @@
       </w:tblGrid>
       <w:tr>
         <w:trPr>
-          <w:divId w:val="2132360993"/>
+          <w:divId w:val="244918617"/>
           <w:tblHeader/>
         </w:trPr>
         <w:tc>
@@ -745,7 +679,6 @@
                 <w:sz w:val="21"/>
                 <w:szCs w:val="21"/>
               </w:rPr>
-              <w:lastRenderedPageBreak/>
               <w:t>SEO Element</w:t>
             </w:r>
           </w:p>
@@ -829,7 +762,7 @@
       </w:tr>
       <w:tr>
         <w:trPr>
-          <w:divId w:val="2132360993"/>
+          <w:divId w:val="244918617"/>
         </w:trPr>
         <w:tc>
           <w:tcPr>
@@ -925,7 +858,7 @@
       </w:tr>
       <w:tr>
         <w:trPr>
-          <w:divId w:val="2132360993"/>
+          <w:divId w:val="244918617"/>
         </w:trPr>
         <w:tc>
           <w:tcPr>
@@ -955,6 +888,7 @@
                 <w:sz w:val="21"/>
                 <w:szCs w:val="21"/>
               </w:rPr>
+              <w:lastRenderedPageBreak/>
               <w:t>Long-Tail Keywords</w:t>
             </w:r>
           </w:p>
@@ -1082,7 +1016,7 @@
       </w:tr>
       <w:tr>
         <w:trPr>
-          <w:divId w:val="2132360993"/>
+          <w:divId w:val="244918617"/>
         </w:trPr>
         <w:tc>
           <w:tcPr>
@@ -1180,7 +1114,7 @@
       </w:tr>
       <w:tr>
         <w:trPr>
-          <w:divId w:val="2132360993"/>
+          <w:divId w:val="244918617"/>
         </w:trPr>
         <w:tc>
           <w:tcPr>
@@ -1276,7 +1210,7 @@
       </w:tr>
       <w:tr>
         <w:trPr>
-          <w:divId w:val="2132360993"/>
+          <w:divId w:val="244918617"/>
         </w:trPr>
         <w:tc>
           <w:tcPr>
@@ -1446,7 +1380,7 @@
       </w:tr>
       <w:tr>
         <w:trPr>
-          <w:divId w:val="2132360993"/>
+          <w:divId w:val="244918617"/>
         </w:trPr>
         <w:tc>
           <w:tcPr>
@@ -1588,7 +1522,7 @@
       <w:pPr>
         <w:pStyle w:val="Heading2"/>
         <w:spacing w:after="240" w:afterAutospacing="0"/>
-        <w:divId w:val="703558276"/>
+        <w:divId w:val="607927411"/>
         <w:rPr>
           <w:rFonts w:ascii="Segoe UI" w:eastAsia="Times New Roman" w:hAnsi="Segoe UI" w:cs="Segoe UI"/>
           <w:sz w:val="30"/>
@@ -1619,7 +1553,7 @@
       <w:pPr>
         <w:pStyle w:val="NormalWeb"/>
         <w:spacing w:after="300" w:afterAutospacing="0"/>
-        <w:divId w:val="703558276"/>
+        <w:divId w:val="607927411"/>
         <w:rPr>
           <w:rFonts w:ascii="Segoe UI" w:hAnsi="Segoe UI" w:cs="Segoe UI"/>
           <w:sz w:val="20"/>
@@ -1683,7 +1617,7 @@
         <w:shd w:val="clear" w:color="auto" w:fill="FFFFFF"/>
         <w:spacing w:before="100" w:beforeAutospacing="1" w:after="270"/>
         <w:outlineLvl w:val="1"/>
-        <w:divId w:val="999774942"/>
+        <w:divId w:val="1631977930"/>
         <w:rPr>
           <w:rFonts w:ascii="Segoe UI" w:eastAsia="Times New Roman" w:hAnsi="Segoe UI" w:cs="Segoe UI"/>
           <w:b/>
@@ -1706,14 +1640,13 @@
           <w:szCs w:val="42"/>
           <w:lang w:val="en"/>
         </w:rPr>
-        <w:lastRenderedPageBreak/>
         <w:t>Daily Fitness Routine for Beginners: 7 Steps to Better Health</w:t>
       </w:r>
     </w:p>
     <w:p>
       <w:pPr>
         <w:shd w:val="clear" w:color="auto" w:fill="FFFFFF"/>
-        <w:divId w:val="1733455637"/>
+        <w:divId w:val="1309433178"/>
         <w:rPr>
           <w:rFonts w:ascii="Segoe UI" w:eastAsia="Times New Roman" w:hAnsi="Segoe UI" w:cs="Segoe UI"/>
           <w:sz w:val="20"/>
@@ -1728,6 +1661,7 @@
           <w:szCs w:val="20"/>
           <w:lang w:val="en"/>
         </w:rPr>
+        <w:lastRenderedPageBreak/>
         <w:t xml:space="preserve">By </w:t>
       </w:r>
       <w:r>
@@ -1754,7 +1688,7 @@
       <w:pPr>
         <w:shd w:val="clear" w:color="auto" w:fill="FFFFFF"/>
         <w:jc w:val="center"/>
-        <w:divId w:val="734815436"/>
+        <w:divId w:val="1832064390"/>
         <w:rPr>
           <w:rFonts w:ascii="Segoe UI" w:eastAsia="Times New Roman" w:hAnsi="Segoe UI" w:cs="Segoe UI"/>
           <w:lang w:val="en"/>
@@ -1767,7 +1701,7 @@
           <w:lang w:val="en"/>
         </w:rPr>
         <w:drawing>
-          <wp:inline distT="0" distB="0" distL="0" distR="0" wp14:anchorId="064D106F" wp14:editId="557C1A8F">
+          <wp:inline distT="0" distB="0" distL="0" distR="0" wp14:anchorId="5CD468AA" wp14:editId="5BC01F7E">
             <wp:extent cx="7620000" cy="3810000"/>
             <wp:effectExtent l="0" t="0" r="0" b="0"/>
             <wp:docPr id="1" name="Picture 1" descr="Beginner doing morning stretching and daily fitness routine for beginners at home"/>
@@ -1824,7 +1758,7 @@
         <w:shd w:val="clear" w:color="auto" w:fill="FFFFFF"/>
         <w:spacing w:before="90" w:after="240"/>
         <w:jc w:val="center"/>
-        <w:divId w:val="734815436"/>
+        <w:divId w:val="1832064390"/>
         <w:rPr>
           <w:rFonts w:ascii="Segoe UI" w:hAnsi="Segoe UI" w:cs="Segoe UI"/>
           <w:color w:val="334155"/>
@@ -1849,7 +1783,7 @@
       <w:pPr>
         <w:shd w:val="clear" w:color="auto" w:fill="FFFFFF"/>
         <w:spacing w:before="100" w:beforeAutospacing="1" w:after="240"/>
-        <w:divId w:val="999774942"/>
+        <w:divId w:val="1631977930"/>
         <w:rPr>
           <w:rFonts w:ascii="Segoe UI" w:hAnsi="Segoe UI" w:cs="Segoe UI"/>
           <w:color w:val="334155"/>
@@ -1894,7 +1828,15 @@
           <w:color w:val="334155"/>
           <w:lang w:val="en"/>
         </w:rPr>
-        <w:t xml:space="preserve"> is the most sustainable way to boost energy, build strength, and improve your overall well-being. When you are just beginning, jumping into intense exercise programs often leads to burnout or muscle soreness. Instead, focusing on gentle, consistent habits helps you stay active every single day without feeling overwhelmed. </w:t>
+        <w:t xml:space="preserve"> </w:t>
+      </w:r>
+      <w:r>
+        <w:rPr>
+          <w:rFonts w:ascii="Segoe UI" w:hAnsi="Segoe UI" w:cs="Segoe UI"/>
+          <w:color w:val="334155"/>
+          <w:lang w:val="en"/>
+        </w:rPr>
+        <w:t xml:space="preserve">is the most sustainable way to boost energy, build strength, and improve your overall well-being. When you are just beginning, jumping into intense exercise programs often leads to burnout or muscle soreness. Instead, focusing on gentle, consistent habits helps you stay active every single day without feeling overwhelmed. </w:t>
       </w:r>
     </w:p>
     <w:p>
@@ -1902,7 +1844,7 @@
         <w:shd w:val="clear" w:color="auto" w:fill="FFFFFF"/>
         <w:spacing w:before="420" w:after="180"/>
         <w:outlineLvl w:val="2"/>
-        <w:divId w:val="999774942"/>
+        <w:divId w:val="1631977930"/>
         <w:rPr>
           <w:rFonts w:ascii="Segoe UI" w:eastAsia="Times New Roman" w:hAnsi="Segoe UI" w:cs="Segoe UI"/>
           <w:b/>
@@ -1930,7 +1872,7 @@
       <w:pPr>
         <w:shd w:val="clear" w:color="auto" w:fill="FFFFFF"/>
         <w:spacing w:before="100" w:beforeAutospacing="1" w:after="240"/>
-        <w:divId w:val="999774942"/>
+        <w:divId w:val="1631977930"/>
         <w:rPr>
           <w:rFonts w:ascii="Segoe UI" w:hAnsi="Segoe UI" w:cs="Segoe UI"/>
           <w:color w:val="334155"/>
@@ -2010,7 +1952,7 @@
         <w:shd w:val="clear" w:color="auto" w:fill="FFFFFF"/>
         <w:spacing w:before="420" w:after="180"/>
         <w:outlineLvl w:val="2"/>
-        <w:divId w:val="999774942"/>
+        <w:divId w:val="1631977930"/>
         <w:rPr>
           <w:rFonts w:ascii="Segoe UI" w:eastAsia="Times New Roman" w:hAnsi="Segoe UI" w:cs="Segoe UI"/>
           <w:b/>
@@ -2039,7 +1981,7 @@
         <w:shd w:val="clear" w:color="auto" w:fill="FFFFFF"/>
         <w:spacing w:before="270" w:after="120"/>
         <w:outlineLvl w:val="3"/>
-        <w:divId w:val="999774942"/>
+        <w:divId w:val="1631977930"/>
         <w:rPr>
           <w:rFonts w:ascii="Segoe UI" w:eastAsia="Times New Roman" w:hAnsi="Segoe UI" w:cs="Segoe UI"/>
           <w:b/>
@@ -2067,7 +2009,7 @@
       <w:pPr>
         <w:shd w:val="clear" w:color="auto" w:fill="FFFFFF"/>
         <w:spacing w:before="100" w:beforeAutospacing="1" w:after="240"/>
-        <w:divId w:val="999774942"/>
+        <w:divId w:val="1631977930"/>
         <w:rPr>
           <w:rFonts w:ascii="Segoe UI" w:hAnsi="Segoe UI" w:cs="Segoe UI"/>
           <w:color w:val="334155"/>
@@ -2088,7 +2030,7 @@
         <w:shd w:val="clear" w:color="auto" w:fill="FFFFFF"/>
         <w:spacing w:before="270" w:after="120"/>
         <w:outlineLvl w:val="3"/>
-        <w:divId w:val="999774942"/>
+        <w:divId w:val="1631977930"/>
         <w:rPr>
           <w:rFonts w:ascii="Segoe UI" w:eastAsia="Times New Roman" w:hAnsi="Segoe UI" w:cs="Segoe UI"/>
           <w:b/>
@@ -2116,20 +2058,19 @@
       <w:pPr>
         <w:shd w:val="clear" w:color="auto" w:fill="FFFFFF"/>
         <w:spacing w:before="100" w:beforeAutospacing="1" w:after="240"/>
-        <w:divId w:val="999774942"/>
-        <w:rPr>
-          <w:rFonts w:ascii="Segoe UI" w:hAnsi="Segoe UI" w:cs="Segoe UI"/>
-          <w:color w:val="334155"/>
-          <w:lang w:val="en"/>
-        </w:rPr>
-      </w:pPr>
-      <w:r>
-        <w:rPr>
-          <w:rFonts w:ascii="Segoe UI" w:hAnsi="Segoe UI" w:cs="Segoe UI"/>
-          <w:color w:val="334155"/>
-          <w:lang w:val="en"/>
-        </w:rPr>
-        <w:lastRenderedPageBreak/>
+        <w:divId w:val="1631977930"/>
+        <w:rPr>
+          <w:rFonts w:ascii="Segoe UI" w:hAnsi="Segoe UI" w:cs="Segoe UI"/>
+          <w:color w:val="334155"/>
+          <w:lang w:val="en"/>
+        </w:rPr>
+      </w:pPr>
+      <w:r>
+        <w:rPr>
+          <w:rFonts w:ascii="Segoe UI" w:hAnsi="Segoe UI" w:cs="Segoe UI"/>
+          <w:color w:val="334155"/>
+          <w:lang w:val="en"/>
+        </w:rPr>
         <w:t xml:space="preserve">You do not need dumbbells or gym machines to build strength. Incorporate foundational bodyweight exercises such as bodyweight squats, wall push-ups, knee planks, and gentle lunges. Aim for 2 sets of 8 to 10 repetitions per exercise. Mastering proper posture ensures you progress safely into a complete </w:t>
       </w:r>
       <w:r>
@@ -2154,7 +2095,7 @@
       <w:pPr>
         <w:shd w:val="clear" w:color="auto" w:fill="FFFFFF"/>
         <w:jc w:val="center"/>
-        <w:divId w:val="2140948520"/>
+        <w:divId w:val="1369067415"/>
         <w:rPr>
           <w:rFonts w:ascii="Segoe UI" w:eastAsia="Times New Roman" w:hAnsi="Segoe UI" w:cs="Segoe UI"/>
           <w:lang w:val="en"/>
@@ -2166,8 +2107,9 @@
           <w:noProof/>
           <w:lang w:val="en"/>
         </w:rPr>
+        <w:lastRenderedPageBreak/>
         <w:drawing>
-          <wp:inline distT="0" distB="0" distL="0" distR="0" wp14:anchorId="1513CE8C" wp14:editId="33E7883C">
+          <wp:inline distT="0" distB="0" distL="0" distR="0" wp14:anchorId="74850787" wp14:editId="2E7EAF52">
             <wp:extent cx="7620000" cy="4000500"/>
             <wp:effectExtent l="0" t="0" r="0" b="0"/>
             <wp:docPr id="2" name="Picture 2" descr="Step-by-step home workout for beginners featuring basic bodyweight exercises"/>
@@ -2224,7 +2166,7 @@
         <w:shd w:val="clear" w:color="auto" w:fill="FFFFFF"/>
         <w:spacing w:before="90" w:after="240"/>
         <w:jc w:val="center"/>
-        <w:divId w:val="2140948520"/>
+        <w:divId w:val="1369067415"/>
         <w:rPr>
           <w:rFonts w:ascii="Segoe UI" w:hAnsi="Segoe UI" w:cs="Segoe UI"/>
           <w:color w:val="334155"/>
@@ -2250,7 +2192,7 @@
         <w:shd w:val="clear" w:color="auto" w:fill="FFFFFF"/>
         <w:spacing w:before="270" w:after="120"/>
         <w:outlineLvl w:val="3"/>
-        <w:divId w:val="999774942"/>
+        <w:divId w:val="1631977930"/>
         <w:rPr>
           <w:rFonts w:ascii="Segoe UI" w:eastAsia="Times New Roman" w:hAnsi="Segoe UI" w:cs="Segoe UI"/>
           <w:b/>
@@ -2278,7 +2220,7 @@
       <w:pPr>
         <w:shd w:val="clear" w:color="auto" w:fill="FFFFFF"/>
         <w:spacing w:before="100" w:beforeAutospacing="1" w:after="240"/>
-        <w:divId w:val="999774942"/>
+        <w:divId w:val="1631977930"/>
         <w:rPr>
           <w:rFonts w:ascii="Segoe UI" w:hAnsi="Segoe UI" w:cs="Segoe UI"/>
           <w:color w:val="334155"/>
@@ -2318,7 +2260,7 @@
         <w:shd w:val="clear" w:color="auto" w:fill="FFFFFF"/>
         <w:spacing w:before="270" w:after="120"/>
         <w:outlineLvl w:val="3"/>
-        <w:divId w:val="999774942"/>
+        <w:divId w:val="1631977930"/>
         <w:rPr>
           <w:rFonts w:ascii="Segoe UI" w:eastAsia="Times New Roman" w:hAnsi="Segoe UI" w:cs="Segoe UI"/>
           <w:b/>
@@ -2346,7 +2288,7 @@
       <w:pPr>
         <w:shd w:val="clear" w:color="auto" w:fill="FFFFFF"/>
         <w:spacing w:before="100" w:beforeAutospacing="1" w:after="240"/>
-        <w:divId w:val="999774942"/>
+        <w:divId w:val="1631977930"/>
         <w:rPr>
           <w:rFonts w:ascii="Segoe UI" w:hAnsi="Segoe UI" w:cs="Segoe UI"/>
           <w:color w:val="334155"/>
@@ -2367,7 +2309,7 @@
         <w:shd w:val="clear" w:color="auto" w:fill="FFFFFF"/>
         <w:spacing w:before="270" w:after="120"/>
         <w:outlineLvl w:val="3"/>
-        <w:divId w:val="999774942"/>
+        <w:divId w:val="1631977930"/>
         <w:rPr>
           <w:rFonts w:ascii="Segoe UI" w:eastAsia="Times New Roman" w:hAnsi="Segoe UI" w:cs="Segoe UI"/>
           <w:b/>
@@ -2395,7 +2337,7 @@
       <w:pPr>
         <w:shd w:val="clear" w:color="auto" w:fill="FFFFFF"/>
         <w:spacing w:before="100" w:beforeAutospacing="1" w:after="240"/>
-        <w:divId w:val="999774942"/>
+        <w:divId w:val="1631977930"/>
         <w:rPr>
           <w:rFonts w:ascii="Segoe UI" w:hAnsi="Segoe UI" w:cs="Segoe UI"/>
           <w:color w:val="334155"/>
@@ -2435,7 +2377,7 @@
         <w:shd w:val="clear" w:color="auto" w:fill="FFFFFF"/>
         <w:spacing w:before="270" w:after="120"/>
         <w:outlineLvl w:val="3"/>
-        <w:divId w:val="999774942"/>
+        <w:divId w:val="1631977930"/>
         <w:rPr>
           <w:rFonts w:ascii="Segoe UI" w:eastAsia="Times New Roman" w:hAnsi="Segoe UI" w:cs="Segoe UI"/>
           <w:b/>
@@ -2463,7 +2405,7 @@
       <w:pPr>
         <w:shd w:val="clear" w:color="auto" w:fill="FFFFFF"/>
         <w:spacing w:before="100" w:beforeAutospacing="1" w:after="240"/>
-        <w:divId w:val="999774942"/>
+        <w:divId w:val="1631977930"/>
         <w:rPr>
           <w:rFonts w:ascii="Segoe UI" w:hAnsi="Segoe UI" w:cs="Segoe UI"/>
           <w:color w:val="334155"/>
@@ -2524,7 +2466,7 @@
         <w:shd w:val="clear" w:color="auto" w:fill="FFFFFF"/>
         <w:spacing w:before="270" w:after="120"/>
         <w:outlineLvl w:val="3"/>
-        <w:divId w:val="999774942"/>
+        <w:divId w:val="1631977930"/>
         <w:rPr>
           <w:rFonts w:ascii="Segoe UI" w:eastAsia="Times New Roman" w:hAnsi="Segoe UI" w:cs="Segoe UI"/>
           <w:b/>
@@ -2552,20 +2494,19 @@
       <w:pPr>
         <w:shd w:val="clear" w:color="auto" w:fill="FFFFFF"/>
         <w:spacing w:before="100" w:beforeAutospacing="1" w:after="240"/>
-        <w:divId w:val="999774942"/>
-        <w:rPr>
-          <w:rFonts w:ascii="Segoe UI" w:hAnsi="Segoe UI" w:cs="Segoe UI"/>
-          <w:color w:val="334155"/>
-          <w:lang w:val="en"/>
-        </w:rPr>
-      </w:pPr>
-      <w:r>
-        <w:rPr>
-          <w:rFonts w:ascii="Segoe UI" w:hAnsi="Segoe UI" w:cs="Segoe UI"/>
-          <w:color w:val="334155"/>
-          <w:lang w:val="en"/>
-        </w:rPr>
-        <w:lastRenderedPageBreak/>
+        <w:divId w:val="1631977930"/>
+        <w:rPr>
+          <w:rFonts w:ascii="Segoe UI" w:hAnsi="Segoe UI" w:cs="Segoe UI"/>
+          <w:color w:val="334155"/>
+          <w:lang w:val="en"/>
+        </w:rPr>
+      </w:pPr>
+      <w:r>
+        <w:rPr>
+          <w:rFonts w:ascii="Segoe UI" w:hAnsi="Segoe UI" w:cs="Segoe UI"/>
+          <w:color w:val="334155"/>
+          <w:lang w:val="en"/>
+        </w:rPr>
         <w:t xml:space="preserve">Your muscles rebuild and grow stronger when you rest. Ensure you get 7 to 8 hours of restorative sleep each night. Learn more about the </w:t>
       </w:r>
       <w:hyperlink r:id="rId16" w:tgtFrame="_blank" w:history="1">
@@ -2593,7 +2534,7 @@
         <w:shd w:val="clear" w:color="auto" w:fill="FFFFFF"/>
         <w:spacing w:before="420" w:after="180"/>
         <w:outlineLvl w:val="2"/>
-        <w:divId w:val="999774942"/>
+        <w:divId w:val="1631977930"/>
         <w:rPr>
           <w:rFonts w:ascii="Segoe UI" w:eastAsia="Times New Roman" w:hAnsi="Segoe UI" w:cs="Segoe UI"/>
           <w:b/>
@@ -2621,19 +2562,20 @@
       <w:pPr>
         <w:shd w:val="clear" w:color="auto" w:fill="FFFFFF"/>
         <w:spacing w:before="100" w:beforeAutospacing="1" w:after="240"/>
-        <w:divId w:val="999774942"/>
-        <w:rPr>
-          <w:rFonts w:ascii="Segoe UI" w:hAnsi="Segoe UI" w:cs="Segoe UI"/>
-          <w:color w:val="334155"/>
-          <w:lang w:val="en"/>
-        </w:rPr>
-      </w:pPr>
-      <w:r>
-        <w:rPr>
-          <w:rFonts w:ascii="Segoe UI" w:hAnsi="Segoe UI" w:cs="Segoe UI"/>
-          <w:color w:val="334155"/>
-          <w:lang w:val="en"/>
-        </w:rPr>
+        <w:divId w:val="1631977930"/>
+        <w:rPr>
+          <w:rFonts w:ascii="Segoe UI" w:hAnsi="Segoe UI" w:cs="Segoe UI"/>
+          <w:color w:val="334155"/>
+          <w:lang w:val="en"/>
+        </w:rPr>
+      </w:pPr>
+      <w:r>
+        <w:rPr>
+          <w:rFonts w:ascii="Segoe UI" w:hAnsi="Segoe UI" w:cs="Segoe UI"/>
+          <w:color w:val="334155"/>
+          <w:lang w:val="en"/>
+        </w:rPr>
+        <w:lastRenderedPageBreak/>
         <w:t xml:space="preserve">Medical experts at the </w:t>
       </w:r>
       <w:hyperlink r:id="rId17" w:tgtFrame="_blank" w:history="1">
@@ -2693,7 +2635,7 @@
         <w:shd w:val="clear" w:color="auto" w:fill="FFFFFF"/>
         <w:spacing w:before="420" w:after="180"/>
         <w:outlineLvl w:val="2"/>
-        <w:divId w:val="999774942"/>
+        <w:divId w:val="1631977930"/>
         <w:rPr>
           <w:rFonts w:ascii="Segoe UI" w:eastAsia="Times New Roman" w:hAnsi="Segoe UI" w:cs="Segoe UI"/>
           <w:b/>
@@ -2721,7 +2663,7 @@
       <w:pPr>
         <w:shd w:val="clear" w:color="auto" w:fill="FFFFFF"/>
         <w:spacing w:before="100" w:beforeAutospacing="1" w:after="240"/>
-        <w:divId w:val="999774942"/>
+        <w:divId w:val="1631977930"/>
         <w:rPr>
           <w:rFonts w:ascii="Segoe UI" w:hAnsi="Segoe UI" w:cs="Segoe UI"/>
           <w:color w:val="334155"/>

</xml_diff>